<commit_message>
Sync website content 2026-05-25 13:24
</commit_message>
<xml_diff>
--- a/组合介绍/普林格周期判断的因子依据.docx
+++ b/组合介绍/普林格周期判断的因子依据.docx
@@ -945,7 +945,7 @@
             <v:path gradientshapeok="t" o:connecttype="rect" o:extrusionok="f"/>
             <o:lock aspectratio="t" v:ext="edit"/>
           </v:shapetype>
-          <v:shape id="_x0000_i1025" style="width:414pt;height:187pt;mso-width-percent:0;mso-height-percent:0;mso-width-percent:0;mso-height-percent:0" type="#_x0000_t75" o:ole="">
+          <v:shape id="_x0000_i1025" style="width:414pt;height:147pt;mso-width-percent:0;mso-height-percent:0;mso-width-percent:0;mso-height-percent:0" type="#_x0000_t75" o:ole="">
             <v:imagedata r:id="rId6" o:title=""/>
           </v:shape>
           <o:OLEObject DrawAspect="Icon" ObjectID="_1718471219" ProgID="Excel.Sheet.12" ShapeID="_x0000_i1025" Type="Embed" r:id="rId5"/>
@@ -1870,7 +1870,7 @@
       <w:r>
         <w:drawing>
           <wp:inline distT="0" distR="0" distB="0" distL="0">
-            <wp:extent cx="5257800" cy="5943600"/>
+            <wp:extent cx="5257800" cy="6010275"/>
             <wp:docPr id="1" name="Drawing 1" descr=""/>
             <a:graphic xmlns:a="http://schemas.openxmlformats.org/drawingml/2006/main">
               <a:graphicData uri="http://schemas.openxmlformats.org/drawingml/2006/picture">
@@ -1890,7 +1890,7 @@
                   <pic:spPr>
                     <a:xfrm>
                       <a:off x="0" y="0"/>
-                      <a:ext cx="5257800" cy="5943600"/>
+                      <a:ext cx="5257800" cy="6010275"/>
                     </a:xfrm>
                     <a:prstGeom prst="rect">
                       <a:avLst/>
@@ -1902,6 +1902,13 @@
           </wp:inline>
         </w:drawing>
       </w:r>
+    </w:p>
+    <w:p>
+      <w:pPr>
+        <w:spacing w:before="120" w:after="120" w:line="288" w:lineRule="auto"/>
+        <w:ind w:left="0"/>
+        <w:jc w:val="left"/>
+      </w:pPr>
     </w:p>
     <w:p>
       <w:pPr>
@@ -4237,6 +4244,449 @@
         <w:t xml:space="preserve"> 作为三因子方向判定窗口。这一设定兼顾了数学分析结果和投资逻辑解释，使三因子框架更适合用于中长期宏观资产配置。</w:t>
       </w:r>
     </w:p>
+    <w:p>
+      <w:pPr>
+        <w:spacing w:before="120" w:after="120" w:line="288" w:lineRule="auto"/>
+        <w:ind w:left="0"/>
+        <w:jc w:val="left"/>
+      </w:pPr>
+      <w:r>
+        <w:rPr>
+          <w:rFonts w:eastAsia="等线" w:ascii="Arial" w:cs="Arial" w:hAnsi="Arial"/>
+          <w:sz w:val="22"/>
+        </w:rPr>
+        <w:t>下面这部分可以直接作为报告新增章节，建议放在“方法优势与局限”之前，标题可设为：</w:t>
+      </w:r>
+    </w:p>
+    <w:p>
+      <w:pPr>
+        <w:pBdr>
+          <w:bottom w:val="single" w:color="dee0e3"/>
+          <w:between w:val="single" w:color="dee0e3"/>
+        </w:pBdr>
+        <w:spacing w:before="120" w:after="120" w:line="288" w:lineRule="auto"/>
+        <w:ind w:left="0"/>
+      </w:pPr>
+    </w:p>
+    <w:p>
+      <w:pPr>
+        <w:pStyle w:val="1"/>
+        <w:spacing w:before="380" w:after="140" w:line="288" w:lineRule="auto"/>
+        <w:ind w:left="0"/>
+        <w:jc w:val="left"/>
+        <w:outlineLvl w:val="0"/>
+      </w:pPr>
+      <w:bookmarkStart w:name="heading_38" w:id="38"/>
+      <w:r>
+        <w:rPr>
+          <w:rFonts w:eastAsia="等线" w:ascii="Arial" w:cs="Arial" w:hAnsi="Arial"/>
+          <w:b w:val="true"/>
+          <w:sz w:val="36"/>
+        </w:rPr>
+        <w:t>Q＆A</w:t>
+      </w:r>
+      <w:bookmarkEnd w:id="38"/>
+    </w:p>
+    <w:p>
+      <w:pPr>
+        <w:pStyle w:val="2"/>
+        <w:spacing w:before="320" w:after="120" w:line="288" w:lineRule="auto"/>
+        <w:ind w:left="0"/>
+        <w:jc w:val="left"/>
+        <w:outlineLvl w:val="1"/>
+      </w:pPr>
+      <w:bookmarkStart w:name="heading_39" w:id="39"/>
+      <w:r>
+        <w:rPr>
+          <w:rFonts w:eastAsia="等线" w:ascii="Arial" w:cs="Arial" w:hAnsi="Arial"/>
+          <w:b w:val="true"/>
+          <w:sz w:val="32"/>
+        </w:rPr>
+        <w:t>Q1：底层指标采用等权合成是否科学？是否应该相关性越高权重越高？</w:t>
+      </w:r>
+      <w:bookmarkEnd w:id="39"/>
+    </w:p>
+    <w:p>
+      <w:pPr>
+        <w:spacing w:before="120" w:after="120" w:line="288" w:lineRule="auto"/>
+        <w:ind w:left="0"/>
+        <w:jc w:val="left"/>
+      </w:pPr>
+      <w:r>
+        <w:rPr>
+          <w:rFonts w:eastAsia="等线" w:ascii="Arial" w:cs="Arial" w:hAnsi="Arial"/>
+          <w:b w:val="true"/>
+          <w:sz w:val="22"/>
+        </w:rPr>
+        <w:t>答：等权合成是科学且稳健的，本模型最终采用“相关性筛选 + 等权合成”的方法，而不是简单按照相关性赋权。</w:t>
+      </w:r>
+    </w:p>
+    <w:p>
+      <w:pPr>
+        <w:spacing w:before="120" w:after="120" w:line="288" w:lineRule="auto"/>
+        <w:ind w:left="0"/>
+        <w:jc w:val="left"/>
+      </w:pPr>
+      <w:r>
+        <w:rPr>
+          <w:rFonts w:eastAsia="等线" w:ascii="Arial" w:cs="Arial" w:hAnsi="Arial"/>
+          <w:sz w:val="22"/>
+        </w:rPr>
+        <w:t>在增长因子和通胀因子的构建中，模型已经先通过领先相关性检验筛选出与基准周期关系较强的指标。例如，增长因子以 PMI 周期项为基准，通胀因子以 CPI 和 PPI 动态加权形成的广义通胀基准为参照，分别筛选出相关性较高的候选指标。</w:t>
+      </w:r>
+    </w:p>
+    <w:p>
+      <w:pPr>
+        <w:spacing w:before="120" w:after="120" w:line="288" w:lineRule="auto"/>
+        <w:ind w:left="0"/>
+        <w:jc w:val="left"/>
+      </w:pPr>
+      <w:r>
+        <w:rPr>
+          <w:rFonts w:eastAsia="等线" w:ascii="Arial" w:cs="Arial" w:hAnsi="Arial"/>
+          <w:sz w:val="22"/>
+        </w:rPr>
+        <w:t>因此，相关性在模型中已经发挥了“筛选有效指标”的作用。如果在最终合成阶段继续按照相关性赋予更高权重，就相当于将相关性重复使用两次：先用相关性选指标，再用相关性放大权重。这可能会使历史相关性较高的指标被过度强化，从而增加过拟合风险。</w:t>
+      </w:r>
+    </w:p>
+    <w:p>
+      <w:pPr>
+        <w:spacing w:before="120" w:after="120" w:line="288" w:lineRule="auto"/>
+        <w:ind w:left="0"/>
+        <w:jc w:val="left"/>
+      </w:pPr>
+      <w:r>
+        <w:rPr>
+          <w:rFonts w:eastAsia="等线" w:ascii="Arial" w:cs="Arial" w:hAnsi="Arial"/>
+          <w:sz w:val="22"/>
+        </w:rPr>
+        <w:t>宏观指标还存在样本不长、相关性不稳定、指标之间共线性较强等问题。例如，能源价格、工业品价格和综合商品指数之间可能共同反映商品周期；工业生产、发电量和工程机械产量之间也可能共同反映实体需求变化。如果简单按相关性加权，可能导致某一类宏观信息在因子中被过度放大。</w:t>
+      </w:r>
+    </w:p>
+    <w:p>
+      <w:pPr>
+        <w:spacing w:before="120" w:after="120" w:line="288" w:lineRule="auto"/>
+        <w:ind w:left="0"/>
+        <w:jc w:val="left"/>
+      </w:pPr>
+      <w:r>
+        <w:rPr>
+          <w:rFonts w:eastAsia="等线" w:ascii="Arial" w:cs="Arial" w:hAnsi="Arial"/>
+          <w:sz w:val="22"/>
+        </w:rPr>
+        <w:t>因此，本模型在完成领先相关性筛选和必要的同类指标去重后，对最终入选指标进行滚动标准化，并采用等权方式合成。该方法强调稳健性和广义代表性，使最终因子不依赖单一高相关指标，而是综合反映多个宏观维度的共同变化。</w:t>
+      </w:r>
+    </w:p>
+    <w:p>
+      <w:pPr>
+        <w:pBdr>
+          <w:bottom w:val="single" w:color="dee0e3"/>
+          <w:between w:val="single" w:color="dee0e3"/>
+        </w:pBdr>
+        <w:spacing w:before="120" w:after="120" w:line="288" w:lineRule="auto"/>
+        <w:ind w:left="0"/>
+      </w:pPr>
+    </w:p>
+    <w:p>
+      <w:pPr>
+        <w:pStyle w:val="2"/>
+        <w:spacing w:before="320" w:after="120" w:line="288" w:lineRule="auto"/>
+        <w:ind w:left="0"/>
+        <w:jc w:val="left"/>
+        <w:outlineLvl w:val="1"/>
+      </w:pPr>
+      <w:bookmarkStart w:name="heading_40" w:id="40"/>
+      <w:r>
+        <w:rPr>
+          <w:rFonts w:eastAsia="等线" w:ascii="Arial" w:cs="Arial" w:hAnsi="Arial"/>
+          <w:b w:val="true"/>
+          <w:sz w:val="32"/>
+        </w:rPr>
+        <w:t>Q2：领先月数为 0 的指标是否应该被过滤？</w:t>
+      </w:r>
+      <w:bookmarkEnd w:id="40"/>
+    </w:p>
+    <w:p>
+      <w:pPr>
+        <w:spacing w:before="120" w:after="120" w:line="288" w:lineRule="auto"/>
+        <w:ind w:left="0"/>
+        <w:jc w:val="left"/>
+      </w:pPr>
+      <w:r>
+        <w:rPr>
+          <w:rFonts w:eastAsia="等线" w:ascii="Arial" w:cs="Arial" w:hAnsi="Arial"/>
+          <w:b w:val="true"/>
+          <w:sz w:val="22"/>
+        </w:rPr>
+        <w:t>答：如果因子的目标只是刻画当前宏观状态，领先月数为 0 的指标可以作为同步确认信号保留；但在本模型中，因子合成的重要目的之一是降低宏观数据发布滞后带来的影响，因此最终合成应优先选择具有正领先期的指标。</w:t>
+      </w:r>
+    </w:p>
+    <w:p>
+      <w:pPr>
+        <w:spacing w:before="120" w:after="120" w:line="288" w:lineRule="auto"/>
+        <w:ind w:left="0"/>
+        <w:jc w:val="left"/>
+      </w:pPr>
+      <w:r>
+        <w:rPr>
+          <w:rFonts w:eastAsia="等线" w:ascii="Arial" w:cs="Arial" w:hAnsi="Arial"/>
+          <w:sz w:val="22"/>
+        </w:rPr>
+        <w:t>领先月数为 0 表示该指标与基准周期在同月相关性最高，更多反映同步关系，而不是领先关系。对于增长因子和通胀因子而言，模型希望通过更高频、更市场化或更早反映产业链变化的指标，提前捕捉 PMI、CPI/PPI 等宏观数据的周期变化。因此，领先月数为 0 的指标虽然具有状态确认价值，但不应成为领先型宏观因子的主要构成。</w:t>
+      </w:r>
+    </w:p>
+    <w:p>
+      <w:pPr>
+        <w:spacing w:before="120" w:after="120" w:line="288" w:lineRule="auto"/>
+        <w:ind w:left="0"/>
+        <w:jc w:val="left"/>
+      </w:pPr>
+      <w:r>
+        <w:rPr>
+          <w:rFonts w:eastAsia="等线" w:ascii="Arial" w:cs="Arial" w:hAnsi="Arial"/>
+          <w:sz w:val="22"/>
+        </w:rPr>
+        <w:t>在最终筛选中，模型优先选择同时满足“相关性较高”和“领先月数大于 0”的指标。若某些领先月数为 0 的指标具有极强经济含义或相关性显著高于其他候选指标，可以作为同步确认指标少量保留，但应设置数量约束，避免最终因子退化为同步确认指标。</w:t>
+      </w:r>
+    </w:p>
+    <w:p>
+      <w:pPr>
+        <w:spacing w:before="120" w:after="120" w:line="288" w:lineRule="auto"/>
+        <w:ind w:left="0"/>
+        <w:jc w:val="left"/>
+      </w:pPr>
+      <w:r>
+        <w:rPr>
+          <w:rFonts w:eastAsia="等线" w:ascii="Arial" w:cs="Arial" w:hAnsi="Arial"/>
+          <w:sz w:val="22"/>
+        </w:rPr>
+        <w:t>因此，本模型对领先月数为 0 的指标采取“限制保留”而非“完全无约束纳入”的原则：优先使用领先指标，必要时少量保留同步指标作为稳定性补充。</w:t>
+      </w:r>
+    </w:p>
+    <w:p>
+      <w:pPr>
+        <w:pBdr>
+          <w:bottom w:val="single" w:color="dee0e3"/>
+          <w:between w:val="single" w:color="dee0e3"/>
+        </w:pBdr>
+        <w:spacing w:before="120" w:after="120" w:line="288" w:lineRule="auto"/>
+        <w:ind w:left="0"/>
+      </w:pPr>
+    </w:p>
+    <w:p>
+      <w:pPr>
+        <w:pStyle w:val="2"/>
+        <w:spacing w:before="320" w:after="120" w:line="288" w:lineRule="auto"/>
+        <w:ind w:left="0"/>
+        <w:jc w:val="left"/>
+        <w:outlineLvl w:val="1"/>
+      </w:pPr>
+      <w:bookmarkStart w:name="heading_41" w:id="41"/>
+      <w:r>
+        <w:rPr>
+          <w:rFonts w:eastAsia="等线" w:ascii="Arial" w:cs="Arial" w:hAnsi="Arial"/>
+          <w:b w:val="true"/>
+          <w:sz w:val="32"/>
+        </w:rPr>
+        <w:t>Q3：猪肉价格对 CPI 影响很大，为什么最终通胀因子没有采用猪肉价格？</w:t>
+      </w:r>
+      <w:bookmarkEnd w:id="41"/>
+    </w:p>
+    <w:p>
+      <w:pPr>
+        <w:spacing w:before="120" w:after="120" w:line="288" w:lineRule="auto"/>
+        <w:ind w:left="0"/>
+        <w:jc w:val="left"/>
+      </w:pPr>
+      <w:r>
+        <w:rPr>
+          <w:rFonts w:eastAsia="等线" w:ascii="Arial" w:cs="Arial" w:hAnsi="Arial"/>
+          <w:b w:val="true"/>
+          <w:sz w:val="22"/>
+        </w:rPr>
+        <w:t>答：合理。因为本模型构建的是“广义通胀因子”，不是单一 CPI 预测因子。</w:t>
+      </w:r>
+    </w:p>
+    <w:p>
+      <w:pPr>
+        <w:spacing w:before="120" w:after="120" w:line="288" w:lineRule="auto"/>
+        <w:ind w:left="0"/>
+        <w:jc w:val="left"/>
+      </w:pPr>
+      <w:r>
+        <w:rPr>
+          <w:rFonts w:eastAsia="等线" w:ascii="Arial" w:cs="Arial" w:hAnsi="Arial"/>
+          <w:sz w:val="22"/>
+        </w:rPr>
+        <w:t>猪肉价格对 CPI 尤其是食品 CPI 的影响确实很大，在部分阶段会显著推高或拉低居民消费价格。但本模型的通胀因子并不是单纯预测 CPI，而是以 CPI 和 PPI 动态加权构建的广义通胀基准为参照，筛选能够解释整体价格周期的领先指标。</w:t>
+      </w:r>
+    </w:p>
+    <w:p>
+      <w:pPr>
+        <w:spacing w:before="120" w:after="120" w:line="288" w:lineRule="auto"/>
+        <w:ind w:left="0"/>
+        <w:jc w:val="left"/>
+      </w:pPr>
+      <w:r>
+        <w:rPr>
+          <w:rFonts w:eastAsia="等线" w:ascii="Arial" w:cs="Arial" w:hAnsi="Arial"/>
+          <w:sz w:val="22"/>
+        </w:rPr>
+        <w:t>在这一框架下，最终入选的指标更多集中在能源、工业品、综合商品和部分农产品价格上，例如柯桥纺织价格指数、WTI 原油、CRB 综合、CRB 工业、CRB 食用油等。这些指标对 PPI、输入型通胀、成本端通胀和广义价格周期具有更强解释力。</w:t>
+      </w:r>
+    </w:p>
+    <w:p>
+      <w:pPr>
+        <w:spacing w:before="120" w:after="120" w:line="288" w:lineRule="auto"/>
+        <w:ind w:left="0"/>
+        <w:jc w:val="left"/>
+      </w:pPr>
+      <w:r>
+        <w:rPr>
+          <w:rFonts w:eastAsia="等线" w:ascii="Arial" w:cs="Arial" w:hAnsi="Arial"/>
+          <w:sz w:val="22"/>
+        </w:rPr>
+        <w:t>猪肉价格则更偏向居民消费端食品价格，具有较强的供给周期和事件扰动特征。猪周期受能繁母猪存栏、养殖利润、疫病、收储政策、进口和季节性消费等因素影响较大。它对 CPI 食品项重要，但未必稳定代表整体通胀压力的共同趋势。</w:t>
+      </w:r>
+    </w:p>
+    <w:p>
+      <w:pPr>
+        <w:spacing w:before="120" w:after="120" w:line="288" w:lineRule="auto"/>
+        <w:ind w:left="0"/>
+        <w:jc w:val="left"/>
+      </w:pPr>
+      <w:r>
+        <w:rPr>
+          <w:rFonts w:eastAsia="等线" w:ascii="Arial" w:cs="Arial" w:hAnsi="Arial"/>
+          <w:sz w:val="22"/>
+        </w:rPr>
+        <w:t>因此，未将猪肉价格纳入主通胀因子，并不意味着模型忽视猪肉价格的重要性，而是说明模型更关注广义价格压力和成本端通胀。猪肉价格可以作为消费端通胀风险的辅助观察变量，用于监控 CPI 结构性扰动，但不必强行进入主因子合成。</w:t>
+      </w:r>
+    </w:p>
+    <w:p>
+      <w:pPr>
+        <w:pBdr>
+          <w:bottom w:val="single" w:color="dee0e3"/>
+          <w:between w:val="single" w:color="dee0e3"/>
+        </w:pBdr>
+        <w:spacing w:before="120" w:after="120" w:line="288" w:lineRule="auto"/>
+        <w:ind w:left="0"/>
+      </w:pPr>
+    </w:p>
+    <w:p>
+      <w:pPr>
+        <w:pStyle w:val="2"/>
+        <w:spacing w:before="320" w:after="120" w:line="288" w:lineRule="auto"/>
+        <w:ind w:left="0"/>
+        <w:jc w:val="left"/>
+        <w:outlineLvl w:val="1"/>
+      </w:pPr>
+      <w:bookmarkStart w:name="heading_42" w:id="42"/>
+      <w:r>
+        <w:rPr>
+          <w:rFonts w:eastAsia="等线" w:ascii="Arial" w:cs="Arial" w:hAnsi="Arial"/>
+          <w:b w:val="true"/>
+          <w:sz w:val="32"/>
+        </w:rPr>
+        <w:t>Q4：货币因子只使用 1 年期国债收益率是否合理？是否应该加入 10 年期国债收益率、准备金率等其他指标？</w:t>
+      </w:r>
+      <w:bookmarkEnd w:id="42"/>
+    </w:p>
+    <w:p>
+      <w:pPr>
+        <w:spacing w:before="120" w:after="120" w:line="288" w:lineRule="auto"/>
+        <w:ind w:left="0"/>
+        <w:jc w:val="left"/>
+      </w:pPr>
+      <w:r>
+        <w:rPr>
+          <w:rFonts w:eastAsia="等线" w:ascii="Arial" w:cs="Arial" w:hAnsi="Arial"/>
+          <w:b w:val="true"/>
+          <w:sz w:val="22"/>
+        </w:rPr>
+        <w:t>答：使用 1 年期国债收益率是合理的，但需要明确其定位是“短端利率型货币因子”，而不是货币政策全景指数。</w:t>
+      </w:r>
+    </w:p>
+    <w:p>
+      <w:pPr>
+        <w:spacing w:before="120" w:after="120" w:line="288" w:lineRule="auto"/>
+        <w:ind w:left="0"/>
+        <w:jc w:val="left"/>
+      </w:pPr>
+      <w:r>
+        <w:rPr>
+          <w:rFonts w:eastAsia="等线" w:ascii="Arial" w:cs="Arial" w:hAnsi="Arial"/>
+          <w:sz w:val="22"/>
+        </w:rPr>
+        <w:t>本模型中的货币因子使用中国 1 年期国债收益率作为基础变量，并通过单边 HP 滤波提取其相对于长期趋势的周期偏离。模型会在原始利率数据中自动搜索同时包含“国债”和“1年”的指标，并排除美国国债、国开债和利差类指标，最终锁定中国 1 年期国债收益率。</w:t>
+      </w:r>
+    </w:p>
+    <w:p>
+      <w:pPr>
+        <w:spacing w:before="120" w:after="120" w:line="288" w:lineRule="auto"/>
+        <w:ind w:left="0"/>
+        <w:jc w:val="left"/>
+      </w:pPr>
+      <w:r>
+        <w:rPr>
+          <w:rFonts w:eastAsia="等线" w:ascii="Arial" w:cs="Arial" w:hAnsi="Arial"/>
+          <w:sz w:val="22"/>
+        </w:rPr>
+        <w:t>选择 1 年期国债收益率的主要原因在于，它位于利率曲线短端，相比 10 年期国债收益率更容易反映市场资金价格、银行间流动性预期和货币政策边际变化。其方向也较为清晰：利率上行代表资金价格抬升、货币环境边际收紧；利率下行代表资金价格下降、货币环境边际宽松。</w:t>
+      </w:r>
+    </w:p>
+    <w:p>
+      <w:pPr>
+        <w:spacing w:before="120" w:after="120" w:line="288" w:lineRule="auto"/>
+        <w:ind w:left="0"/>
+        <w:jc w:val="left"/>
+      </w:pPr>
+      <w:r>
+        <w:rPr>
+          <w:rFonts w:eastAsia="等线" w:ascii="Arial" w:cs="Arial" w:hAnsi="Arial"/>
+          <w:sz w:val="22"/>
+        </w:rPr>
+        <w:t>10 年期国债收益率当然也重要，但它不完全是货币因子。长端利率同时受到增长预期、通胀预期、期限溢价、风险偏好和债券供需结构影响。如果直接将 10 年期国债收益率纳入货币因子，可能会与增长因子和通胀因子产生信息重叠。</w:t>
+      </w:r>
+    </w:p>
+    <w:p>
+      <w:pPr>
+        <w:spacing w:before="120" w:after="120" w:line="288" w:lineRule="auto"/>
+        <w:ind w:left="0"/>
+        <w:jc w:val="left"/>
+      </w:pPr>
+      <w:r>
+        <w:rPr>
+          <w:rFonts w:eastAsia="等线" w:ascii="Arial" w:cs="Arial" w:hAnsi="Arial"/>
+          <w:sz w:val="22"/>
+        </w:rPr>
+        <w:t>准备金率、MLF 利率、LPR、DR007、社融、M2 等指标也都能够从不同角度反映货币环境。但其中部分指标存在发布频率较低、政策事件跳跃性强、数据连续性不足或与信用周期高度相关等问题。若全部纳入主因子，可能会增加模型复杂度和解释难度。</w:t>
+      </w:r>
+    </w:p>
+    <w:p>
+      <w:pPr>
+        <w:spacing w:before="120" w:after="120" w:line="288" w:lineRule="auto"/>
+        <w:ind w:left="0"/>
+        <w:jc w:val="left"/>
+      </w:pPr>
+      <w:r>
+        <w:rPr>
+          <w:rFonts w:eastAsia="等线" w:ascii="Arial" w:cs="Arial" w:hAnsi="Arial"/>
+          <w:sz w:val="22"/>
+        </w:rPr>
+        <w:t>因此，当前主模型保留 1 年期国债收益率作为货币因子的核心变量，能够保持信号连续、方向清晰和实盘可跟踪。其他指标可以作为辅助观察变量，而不必直接混入当前主因子。</w:t>
+      </w:r>
+    </w:p>
+    <w:p>
+      <w:pPr>
+        <w:pBdr>
+          <w:bottom w:val="single" w:color="dee0e3"/>
+          <w:between w:val="single" w:color="dee0e3"/>
+        </w:pBdr>
+        <w:spacing w:before="120" w:after="120" w:line="288" w:lineRule="auto"/>
+        <w:ind w:left="0"/>
+      </w:pPr>
+    </w:p>
     <w:sectPr>
       <w:footerReference w:type="default" r:id="rId3"/>
       <w:headerReference w:type="default" r:id="rId23"/>
@@ -4260,7 +4710,7 @@
 
 <file path=word/numbering.xml><?xml version="1.0" encoding="utf-8"?>
 <w:numbering xmlns:w="http://schemas.openxmlformats.org/wordprocessingml/2006/main">
-  <w:abstractNum w:abstractNumId="1067058">
+  <w:abstractNum w:abstractNumId="22298">
     <w:lvl>
       <w:numFmt w:val="bullet"/>
       <w:suff w:val="tab"/>
@@ -4270,7 +4720,7 @@
       </w:rPr>
     </w:lvl>
   </w:abstractNum>
-  <w:abstractNum w:abstractNumId="1067059">
+  <w:abstractNum w:abstractNumId="22299">
     <w:lvl>
       <w:numFmt w:val="bullet"/>
       <w:suff w:val="tab"/>
@@ -4280,7 +4730,7 @@
       </w:rPr>
     </w:lvl>
   </w:abstractNum>
-  <w:abstractNum w:abstractNumId="1067060">
+  <w:abstractNum w:abstractNumId="22300">
     <w:lvl>
       <w:numFmt w:val="bullet"/>
       <w:suff w:val="tab"/>
@@ -4290,7 +4740,7 @@
       </w:rPr>
     </w:lvl>
   </w:abstractNum>
-  <w:abstractNum w:abstractNumId="1067061">
+  <w:abstractNum w:abstractNumId="22301">
     <w:lvl>
       <w:start w:val="1"/>
       <w:numFmt w:val="decimal"/>
@@ -4301,7 +4751,7 @@
       </w:rPr>
     </w:lvl>
   </w:abstractNum>
-  <w:abstractNum w:abstractNumId="1067062">
+  <w:abstractNum w:abstractNumId="22302">
     <w:lvl>
       <w:start w:val="2"/>
       <w:numFmt w:val="decimal"/>
@@ -4312,7 +4762,7 @@
       </w:rPr>
     </w:lvl>
   </w:abstractNum>
-  <w:abstractNum w:abstractNumId="1067063">
+  <w:abstractNum w:abstractNumId="22303">
     <w:lvl>
       <w:start w:val="3"/>
       <w:numFmt w:val="decimal"/>
@@ -4323,7 +4773,7 @@
       </w:rPr>
     </w:lvl>
   </w:abstractNum>
-  <w:abstractNum w:abstractNumId="1067064">
+  <w:abstractNum w:abstractNumId="22304">
     <w:lvl>
       <w:start w:val="4"/>
       <w:numFmt w:val="decimal"/>
@@ -4334,7 +4784,7 @@
       </w:rPr>
     </w:lvl>
   </w:abstractNum>
-  <w:abstractNum w:abstractNumId="1067065">
+  <w:abstractNum w:abstractNumId="22305">
     <w:lvl>
       <w:start w:val="5"/>
       <w:numFmt w:val="decimal"/>
@@ -4345,7 +4795,7 @@
       </w:rPr>
     </w:lvl>
   </w:abstractNum>
-  <w:abstractNum w:abstractNumId="1067066">
+  <w:abstractNum w:abstractNumId="22306">
     <w:lvl>
       <w:start w:val="6"/>
       <w:numFmt w:val="decimal"/>
@@ -4357,31 +4807,31 @@
     </w:lvl>
   </w:abstractNum>
   <w:num w:numId="1">
-    <w:abstractNumId w:val="1067058"/>
+    <w:abstractNumId w:val="22298"/>
   </w:num>
   <w:num w:numId="2">
-    <w:abstractNumId w:val="1067059"/>
+    <w:abstractNumId w:val="22299"/>
   </w:num>
   <w:num w:numId="3">
-    <w:abstractNumId w:val="1067060"/>
+    <w:abstractNumId w:val="22300"/>
   </w:num>
   <w:num w:numId="4">
-    <w:abstractNumId w:val="1067061"/>
+    <w:abstractNumId w:val="22301"/>
   </w:num>
   <w:num w:numId="5">
-    <w:abstractNumId w:val="1067062"/>
+    <w:abstractNumId w:val="22302"/>
   </w:num>
   <w:num w:numId="6">
-    <w:abstractNumId w:val="1067063"/>
+    <w:abstractNumId w:val="22303"/>
   </w:num>
   <w:num w:numId="7">
-    <w:abstractNumId w:val="1067064"/>
+    <w:abstractNumId w:val="22304"/>
   </w:num>
   <w:num w:numId="8">
-    <w:abstractNumId w:val="1067065"/>
+    <w:abstractNumId w:val="22305"/>
   </w:num>
   <w:num w:numId="9">
-    <w:abstractNumId w:val="1067066"/>
+    <w:abstractNumId w:val="22306"/>
   </w:num>
 </w:numbering>
 </file>

</xml_diff>